<commit_message>
Update 周二 2026/10/27 21:31:39
</commit_message>
<xml_diff>
--- a/模板库/ku/国标.docx
+++ b/模板库/ku/国标.docx
@@ -1,6 +1,6 @@
 
 <file path=word/document.xml><?xml version="1.0" encoding="utf-8"?>
-<w:document xmlns:wpc="http://schemas.microsoft.com/office/word/2010/wordprocessingCanvas" xmlns:mc="http://schemas.openxmlformats.org/markup-compatibility/2006" xmlns:o="urn:schemas-microsoft-com:office:office" xmlns:r="http://schemas.openxmlformats.org/officeDocument/2006/relationships" xmlns:m="http://schemas.openxmlformats.org/officeDocument/2006/math" xmlns:v="urn:schemas-microsoft-com:vml" xmlns:wp14="http://schemas.microsoft.com/office/word/2010/wordprocessingDrawing" xmlns:wp="http://schemas.openxmlformats.org/drawingml/2006/wordprocessingDrawing" xmlns:w="http://schemas.openxmlformats.org/wordprocessingml/2006/main" xmlns:w14="http://schemas.microsoft.com/office/word/2010/wordml" xmlns:w10="urn:schemas-microsoft-com:office:word" xmlns:w15="http://schemas.microsoft.com/office/word/2012/wordml" xmlns:wpg="http://schemas.microsoft.com/office/word/2010/wordprocessingGroup" xmlns:wpi="http://schemas.microsoft.com/office/word/2010/wordprocessingInk" xmlns:wne="http://schemas.microsoft.com/office/word/2006/wordml" xmlns:wps="http://schemas.microsoft.com/office/word/2010/wordprocessingShape" xmlns:wpsCustomData="http://www.wps.cn/officeDocument/2013/wpsCustomData" mc:Ignorable="w14 w15 wp14">
+<w:document xmlns:wpc="http://schemas.microsoft.com/office/word/2010/wordprocessingCanvas" xmlns:cx="http://schemas.microsoft.com/office/drawing/2014/chartex" xmlns:cx1="http://schemas.microsoft.com/office/drawing/2015/9/8/chartex" xmlns:cx2="http://schemas.microsoft.com/office/drawing/2015/10/21/chartex" xmlns:cx3="http://schemas.microsoft.com/office/drawing/2016/5/9/chartex" xmlns:cx4="http://schemas.microsoft.com/office/drawing/2016/5/10/chartex" xmlns:cx5="http://schemas.microsoft.com/office/drawing/2016/5/11/chartex" xmlns:cx6="http://schemas.microsoft.com/office/drawing/2016/5/12/chartex" xmlns:cx7="http://schemas.microsoft.com/office/drawing/2016/5/13/chartex" xmlns:cx8="http://schemas.microsoft.com/office/drawing/2016/5/14/chartex" xmlns:mc="http://schemas.openxmlformats.org/markup-compatibility/2006" xmlns:o="urn:schemas-microsoft-com:office:office" xmlns:r="http://schemas.openxmlformats.org/officeDocument/2006/relationships" xmlns:m="http://schemas.openxmlformats.org/officeDocument/2006/math" xmlns:v="urn:schemas-microsoft-com:vml" xmlns:wp14="http://schemas.microsoft.com/office/word/2010/wordprocessingDrawing" xmlns:wp="http://schemas.openxmlformats.org/drawingml/2006/wordprocessingDrawing" xmlns:w="http://schemas.openxmlformats.org/wordprocessingml/2006/main" xmlns:w14="http://schemas.microsoft.com/office/word/2010/wordml" xmlns:w10="urn:schemas-microsoft-com:office:word" xmlns:w15="http://schemas.microsoft.com/office/word/2012/wordml" xmlns:wpg="http://schemas.microsoft.com/office/word/2010/wordprocessingGroup" xmlns:wpi="http://schemas.microsoft.com/office/word/2010/wordprocessingInk" xmlns:wne="http://schemas.microsoft.com/office/word/2006/wordml" xmlns:wps="http://schemas.microsoft.com/office/word/2010/wordprocessingShape" xmlns:wpsCustomData="http://www.wps.cn/officeDocument/2013/wpsCustomData" mc:Ignorable="w14 w15 wp14">
   <w:body>
     <w:p>
       <w:pPr>
@@ -96,7 +96,7 @@
           <w:szCs w:val="21"/>
           <w:lang w:val="en-US" w:eastAsia="zh-CN"/>
         </w:rPr>
-        <w:t>样件不连接线束。</w:t>
+        <w:t>不向DUT供电。</w:t>
       </w:r>
     </w:p>
     <w:p>
@@ -123,7 +123,7 @@
           <w:szCs w:val="21"/>
           <w:lang w:val="en-US" w:eastAsia="zh-CN"/>
         </w:rPr>
-        <w:t>工作模式1.1：样件不连接线束。</w:t>
+        <w:t xml:space="preserve">工作模式1.1∶DUT未连接到线束。 </w:t>
       </w:r>
     </w:p>
     <w:p>
@@ -150,13 +150,26 @@
           <w:szCs w:val="21"/>
           <w:lang w:val="en-US" w:eastAsia="zh-CN"/>
         </w:rPr>
-        <w:t>工作模式1.2：样件模拟整车安装位置连接线束，但是不供电。</w:t>
-      </w:r>
-    </w:p>
-    <w:p>
-      <w:pPr>
-        <w:spacing w:line="360" w:lineRule="auto"/>
-        <w:ind w:firstLine="210" w:firstLineChars="100"/>
+        <w:t>工作模式1.2∶DUT模拟在车辆</w:t>
+      </w:r>
+      <w:bookmarkStart w:id="0" w:name="_GoBack"/>
+      <w:bookmarkEnd w:id="0"/>
+      <w:r>
+        <w:rPr>
+          <w:rFonts w:hint="eastAsia" w:ascii="宋体" w:hAnsi="宋体" w:eastAsia="宋体" w:cs="宋体"/>
+          <w:b w:val="0"/>
+          <w:bCs/>
+          <w:color w:val="auto"/>
+          <w:sz w:val="21"/>
+          <w:szCs w:val="21"/>
+          <w:lang w:val="en-US" w:eastAsia="zh-CN"/>
+        </w:rPr>
+        <w:t>上的安装位置，连接到线束。</w:t>
+      </w:r>
+    </w:p>
+    <w:p>
+      <w:pPr>
+        <w:spacing w:line="360" w:lineRule="auto"/>
         <w:jc w:val="left"/>
         <w:rPr>
           <w:rFonts w:hint="eastAsia" w:ascii="宋体" w:hAnsi="宋体" w:eastAsia="宋体" w:cs="宋体"/>
@@ -168,6 +181,18 @@
           <w:lang w:val="en-US" w:eastAsia="zh-CN"/>
         </w:rPr>
       </w:pPr>
+      <w:r>
+        <w:rPr>
+          <w:rFonts w:hint="eastAsia" w:ascii="宋体" w:hAnsi="宋体" w:eastAsia="宋体" w:cs="宋体"/>
+          <w:b w:val="0"/>
+          <w:bCs/>
+          <w:color w:val="auto"/>
+          <w:sz w:val="21"/>
+          <w:szCs w:val="21"/>
+          <w:lang w:val="en-US" w:eastAsia="zh-CN"/>
+        </w:rPr>
+        <w:t>工作模式2</w:t>
+      </w:r>
     </w:p>
     <w:p>
       <w:pPr>
@@ -193,7 +218,7 @@
           <w:szCs w:val="21"/>
           <w:lang w:val="en-US" w:eastAsia="zh-CN"/>
         </w:rPr>
-        <w:t>工作模式2</w:t>
+        <w:t xml:space="preserve">当车辆发动机关闭，且所有电气连接完好，DUT以电压UB带电运行。 </w:t>
       </w:r>
     </w:p>
     <w:p>
@@ -220,32 +245,7 @@
           <w:szCs w:val="21"/>
           <w:lang w:val="en-US" w:eastAsia="zh-CN"/>
         </w:rPr>
-        <w:t>样件仿实车电气连接，以供给电压 U</w:t>
-      </w:r>
-      <w:r>
-        <w:rPr>
-          <w:rFonts w:hint="eastAsia" w:ascii="宋体" w:hAnsi="宋体" w:eastAsia="宋体" w:cs="宋体"/>
-          <w:b w:val="0"/>
-          <w:bCs/>
-          <w:color w:val="auto"/>
-          <w:sz w:val="21"/>
-          <w:szCs w:val="21"/>
-          <w:vertAlign w:val="subscript"/>
-          <w:lang w:val="en-US" w:eastAsia="zh-CN"/>
-        </w:rPr>
-        <w:t>Batt</w:t>
-      </w:r>
-      <w:r>
-        <w:rPr>
-          <w:rFonts w:hint="eastAsia" w:ascii="宋体" w:hAnsi="宋体" w:eastAsia="宋体" w:cs="宋体"/>
-          <w:b w:val="0"/>
-          <w:bCs/>
-          <w:color w:val="auto"/>
-          <w:sz w:val="21"/>
-          <w:szCs w:val="21"/>
-          <w:lang w:val="en-US" w:eastAsia="zh-CN"/>
-        </w:rPr>
-        <w:t xml:space="preserve"> (电池电压，发电机不工作)运行。</w:t>
+        <w:t xml:space="preserve">工作模式2.1∶系统/组件功能不被激活（如休眠模式）。 </w:t>
       </w:r>
     </w:p>
     <w:p>
@@ -272,7 +272,7 @@
           <w:szCs w:val="21"/>
           <w:lang w:val="en-US" w:eastAsia="zh-CN"/>
         </w:rPr>
-        <w:t>工作模式2.1：系统/零部件功能未激活(如: 休眠模式)。</w:t>
+        <w:t>工作模式2.2∶系统/组件带电运行并控制在典型运行模式。</w:t>
       </w:r>
     </w:p>
     <w:p>
@@ -299,13 +299,12 @@
           <w:szCs w:val="21"/>
           <w:lang w:val="en-US" w:eastAsia="zh-CN"/>
         </w:rPr>
-        <w:t>工作模式2.2：系统/零部件在典型工作模式下正常工作。</w:t>
-      </w:r>
-    </w:p>
-    <w:p>
-      <w:pPr>
-        <w:spacing w:line="360" w:lineRule="auto"/>
-        <w:ind w:firstLine="210" w:firstLineChars="100"/>
+        <w:t>工作模式3</w:t>
+      </w:r>
+    </w:p>
+    <w:p>
+      <w:pPr>
+        <w:spacing w:line="360" w:lineRule="auto"/>
         <w:jc w:val="left"/>
         <w:rPr>
           <w:rFonts w:hint="eastAsia" w:ascii="宋体" w:hAnsi="宋体" w:eastAsia="宋体" w:cs="宋体"/>
@@ -317,6 +316,18 @@
           <w:lang w:val="en-US" w:eastAsia="zh-CN"/>
         </w:rPr>
       </w:pPr>
+      <w:r>
+        <w:rPr>
+          <w:rFonts w:hint="eastAsia" w:ascii="宋体" w:hAnsi="宋体" w:eastAsia="宋体" w:cs="宋体"/>
+          <w:b w:val="0"/>
+          <w:bCs/>
+          <w:color w:val="auto"/>
+          <w:sz w:val="21"/>
+          <w:szCs w:val="21"/>
+          <w:lang w:val="en-US" w:eastAsia="zh-CN"/>
+        </w:rPr>
+        <w:t xml:space="preserve">所有电气连接完好，DUT以电压 UA带电运行。 </w:t>
+      </w:r>
     </w:p>
     <w:p>
       <w:pPr>
@@ -342,7 +353,7 @@
           <w:szCs w:val="21"/>
           <w:lang w:val="en-US" w:eastAsia="zh-CN"/>
         </w:rPr>
-        <w:t>工作模式3</w:t>
+        <w:t xml:space="preserve">工作模式3.1∶系统/组件功能不被激活。 </w:t>
       </w:r>
     </w:p>
     <w:p>
@@ -369,86 +380,7 @@
           <w:szCs w:val="21"/>
           <w:lang w:val="en-US" w:eastAsia="zh-CN"/>
         </w:rPr>
-        <w:t>样件仿实车电气连接, 以供给电压 U</w:t>
-      </w:r>
-      <w:r>
-        <w:rPr>
-          <w:rFonts w:hint="eastAsia" w:ascii="宋体" w:hAnsi="宋体" w:eastAsia="宋体" w:cs="宋体"/>
-          <w:b w:val="0"/>
-          <w:bCs/>
-          <w:color w:val="auto"/>
-          <w:sz w:val="21"/>
-          <w:szCs w:val="21"/>
-          <w:vertAlign w:val="subscript"/>
-          <w:lang w:val="en-US" w:eastAsia="zh-CN"/>
-        </w:rPr>
-        <w:t>p</w:t>
-      </w:r>
-      <w:r>
-        <w:rPr>
-          <w:rFonts w:hint="eastAsia" w:ascii="宋体" w:hAnsi="宋体" w:eastAsia="宋体" w:cs="宋体"/>
-          <w:b w:val="0"/>
-          <w:bCs/>
-          <w:color w:val="auto"/>
-          <w:sz w:val="21"/>
-          <w:szCs w:val="21"/>
-          <w:lang w:val="en-US" w:eastAsia="zh-CN"/>
-        </w:rPr>
-        <w:t>（发动机/发电机工作）运行。</w:t>
-      </w:r>
-    </w:p>
-    <w:p>
-      <w:pPr>
-        <w:spacing w:line="360" w:lineRule="auto"/>
-        <w:jc w:val="left"/>
-        <w:rPr>
-          <w:rFonts w:hint="eastAsia" w:ascii="宋体" w:hAnsi="宋体" w:eastAsia="宋体" w:cs="宋体"/>
-          <w:b w:val="0"/>
-          <w:bCs/>
-          <w:color w:val="auto"/>
-          <w:sz w:val="21"/>
-          <w:szCs w:val="21"/>
-          <w:lang w:val="en-US" w:eastAsia="zh-CN"/>
-        </w:rPr>
-      </w:pPr>
-      <w:r>
-        <w:rPr>
-          <w:rFonts w:hint="eastAsia" w:ascii="宋体" w:hAnsi="宋体" w:eastAsia="宋体" w:cs="宋体"/>
-          <w:b w:val="0"/>
-          <w:bCs/>
-          <w:color w:val="auto"/>
-          <w:sz w:val="21"/>
-          <w:szCs w:val="21"/>
-          <w:lang w:val="en-US" w:eastAsia="zh-CN"/>
-        </w:rPr>
-        <w:t>工作模式3.1：系统/零部件功能未激活(如: 休眠模式)。</w:t>
-      </w:r>
-    </w:p>
-    <w:p>
-      <w:pPr>
-        <w:spacing w:line="360" w:lineRule="auto"/>
-        <w:jc w:val="left"/>
-        <w:rPr>
-          <w:rFonts w:hint="eastAsia" w:ascii="宋体" w:hAnsi="宋体" w:eastAsia="宋体" w:cs="宋体"/>
-          <w:b w:val="0"/>
-          <w:bCs/>
-          <w:color w:val="auto"/>
-          <w:sz w:val="21"/>
-          <w:szCs w:val="21"/>
-          <w:lang w:val="en-US" w:eastAsia="zh-CN"/>
-        </w:rPr>
-      </w:pPr>
-      <w:r>
-        <w:rPr>
-          <w:rFonts w:hint="eastAsia" w:ascii="宋体" w:hAnsi="宋体" w:eastAsia="宋体" w:cs="宋体"/>
-          <w:b w:val="0"/>
-          <w:bCs/>
-          <w:color w:val="auto"/>
-          <w:sz w:val="21"/>
-          <w:szCs w:val="21"/>
-          <w:lang w:val="en-US" w:eastAsia="zh-CN"/>
-        </w:rPr>
-        <w:t>工作模式3.2：系统/零部件在典型工作模式下正常工作。</w:t>
+        <w:t>工作模式3.2∶系统/组件带电运行并控制在典型运行模式。</w:t>
       </w:r>
     </w:p>
     <w:p>
@@ -497,24 +429,48 @@
         <w:spacing w:line="360" w:lineRule="auto"/>
         <w:rPr>
           <w:rFonts w:hint="eastAsia" w:ascii="宋体" w:hAnsi="宋体" w:eastAsia="宋体" w:cs="宋体"/>
-          <w:lang w:val="en-US" w:eastAsia="zh-CN"/>
-        </w:rPr>
-      </w:pPr>
-      <w:r>
-        <w:rPr>
-          <w:rFonts w:hint="eastAsia" w:ascii="宋体" w:hAnsi="宋体" w:eastAsia="宋体" w:cs="宋体"/>
-          <w:b w:val="0"/>
-          <w:bCs/>
-          <w:color w:val="auto"/>
-          <w:sz w:val="21"/>
-          <w:szCs w:val="21"/>
-          <w:lang w:val="en-US" w:eastAsia="zh-CN"/>
-        </w:rPr>
-        <w:t>A级：</w:t>
-      </w:r>
-      <w:r>
-        <w:rPr>
-          <w:rFonts w:hint="eastAsia" w:ascii="宋体" w:hAnsi="宋体" w:eastAsia="宋体" w:cs="宋体"/>
+          <w:b w:val="0"/>
+          <w:bCs/>
+          <w:color w:val="auto"/>
+          <w:sz w:val="21"/>
+          <w:szCs w:val="21"/>
+          <w:lang w:val="en-US" w:eastAsia="zh-CN"/>
+        </w:rPr>
+      </w:pPr>
+      <w:r>
+        <w:rPr>
+          <w:rFonts w:hint="eastAsia" w:ascii="宋体" w:hAnsi="宋体" w:eastAsia="宋体" w:cs="宋体"/>
+          <w:b w:val="0"/>
+          <w:bCs/>
+          <w:color w:val="auto"/>
+          <w:sz w:val="21"/>
+          <w:szCs w:val="21"/>
+          <w:lang w:val="en-US" w:eastAsia="zh-CN"/>
+        </w:rPr>
+        <w:t>A级</w:t>
+      </w:r>
+    </w:p>
+    <w:p>
+      <w:pPr>
+        <w:spacing w:line="360" w:lineRule="auto"/>
+        <w:rPr>
+          <w:rFonts w:hint="eastAsia" w:ascii="宋体" w:hAnsi="宋体" w:eastAsia="宋体" w:cs="宋体"/>
+          <w:b w:val="0"/>
+          <w:bCs/>
+          <w:color w:val="auto"/>
+          <w:sz w:val="21"/>
+          <w:szCs w:val="21"/>
+          <w:lang w:val="en-US" w:eastAsia="zh-CN"/>
+        </w:rPr>
+      </w:pPr>
+      <w:r>
+        <w:rPr>
+          <w:rFonts w:hint="eastAsia" w:ascii="宋体" w:hAnsi="宋体" w:eastAsia="宋体" w:cs="宋体"/>
+          <w:b w:val="0"/>
+          <w:bCs/>
+          <w:color w:val="auto"/>
+          <w:sz w:val="21"/>
+          <w:szCs w:val="21"/>
           <w:lang w:val="en-US" w:eastAsia="zh-CN"/>
         </w:rPr>
         <w:t>试验中和试验后，装置/系统所有功能满足设计要求。</w:t>
@@ -525,202 +481,207 @@
         <w:spacing w:line="360" w:lineRule="auto"/>
         <w:rPr>
           <w:rFonts w:hint="eastAsia" w:ascii="宋体" w:hAnsi="宋体" w:eastAsia="宋体" w:cs="宋体"/>
-          <w:lang w:val="en-US" w:eastAsia="zh-CN"/>
-        </w:rPr>
-      </w:pPr>
-    </w:p>
-    <w:p>
-      <w:pPr>
-        <w:spacing w:line="360" w:lineRule="auto"/>
-        <w:rPr>
-          <w:rFonts w:hint="eastAsia" w:ascii="宋体" w:hAnsi="宋体" w:eastAsia="宋体" w:cs="宋体"/>
-          <w:lang w:val="en-US" w:eastAsia="zh-CN"/>
-        </w:rPr>
-      </w:pPr>
-      <w:r>
-        <w:rPr>
-          <w:rFonts w:hint="eastAsia" w:ascii="宋体" w:hAnsi="宋体" w:eastAsia="宋体" w:cs="宋体"/>
-          <w:b w:val="0"/>
-          <w:bCs/>
-          <w:color w:val="auto"/>
-          <w:sz w:val="21"/>
-          <w:szCs w:val="21"/>
-          <w:lang w:val="en-US" w:eastAsia="zh-CN"/>
-        </w:rPr>
-        <w:t>B级：</w:t>
-      </w:r>
-      <w:r>
-        <w:rPr>
-          <w:rFonts w:hint="eastAsia" w:ascii="宋体" w:hAnsi="宋体" w:eastAsia="宋体" w:cs="宋体"/>
-          <w:lang w:val="en-US" w:eastAsia="zh-CN"/>
-        </w:rPr>
-        <w:t>试验中装置</w:t>
-      </w:r>
-      <w:r>
-        <w:rPr>
-          <w:rFonts w:hint="eastAsia" w:ascii="宋体" w:hAnsi="宋体" w:eastAsia="宋体" w:cs="宋体"/>
-          <w:b w:val="0"/>
-          <w:bCs/>
-          <w:color w:val="auto"/>
-          <w:sz w:val="21"/>
-          <w:szCs w:val="21"/>
-          <w:lang w:val="en-US" w:eastAsia="zh-CN"/>
-        </w:rPr>
-        <w:t>/</w:t>
-      </w:r>
-      <w:r>
-        <w:rPr>
-          <w:rFonts w:hint="eastAsia" w:ascii="宋体" w:hAnsi="宋体" w:eastAsia="宋体" w:cs="宋体"/>
-          <w:lang w:val="en-US" w:eastAsia="zh-CN"/>
-        </w:rPr>
-        <w:t>系统所有功能满足设计要求，但允许有一个或多个超出规定允差。试验后所有功能应自动恢复到规定限值。存储器功能应符合A级。</w:t>
-      </w:r>
-    </w:p>
-    <w:p>
-      <w:pPr>
-        <w:spacing w:line="360" w:lineRule="auto"/>
-        <w:rPr>
-          <w:rFonts w:hint="eastAsia" w:ascii="宋体" w:hAnsi="宋体" w:eastAsia="宋体" w:cs="宋体"/>
-          <w:lang w:val="en-US" w:eastAsia="zh-CN"/>
-        </w:rPr>
-      </w:pPr>
-    </w:p>
-    <w:p>
-      <w:pPr>
-        <w:spacing w:line="360" w:lineRule="auto"/>
-        <w:rPr>
-          <w:rFonts w:hint="eastAsia" w:ascii="宋体" w:hAnsi="宋体" w:eastAsia="宋体" w:cs="宋体"/>
-          <w:lang w:val="en-US" w:eastAsia="zh-CN"/>
-        </w:rPr>
-      </w:pPr>
-      <w:r>
-        <w:rPr>
-          <w:rFonts w:hint="eastAsia" w:ascii="宋体" w:hAnsi="宋体" w:eastAsia="宋体" w:cs="宋体"/>
-          <w:b w:val="0"/>
-          <w:bCs/>
-          <w:color w:val="auto"/>
-          <w:sz w:val="21"/>
-          <w:szCs w:val="21"/>
-          <w:lang w:val="en-US" w:eastAsia="zh-CN"/>
-        </w:rPr>
-        <w:t>C级：</w:t>
-      </w:r>
-      <w:r>
-        <w:rPr>
-          <w:rFonts w:hint="eastAsia" w:ascii="宋体" w:hAnsi="宋体" w:eastAsia="宋体" w:cs="宋体"/>
-          <w:lang w:val="en-US" w:eastAsia="zh-CN"/>
-        </w:rPr>
-        <w:t>试验中装置</w:t>
-      </w:r>
-      <w:r>
-        <w:rPr>
-          <w:rFonts w:hint="eastAsia" w:ascii="宋体" w:hAnsi="宋体" w:eastAsia="宋体" w:cs="宋体"/>
-          <w:b w:val="0"/>
-          <w:bCs/>
-          <w:color w:val="auto"/>
-          <w:sz w:val="21"/>
-          <w:szCs w:val="21"/>
-          <w:lang w:val="en-US" w:eastAsia="zh-CN"/>
-        </w:rPr>
-        <w:t>/</w:t>
-      </w:r>
-      <w:r>
-        <w:rPr>
-          <w:rFonts w:hint="eastAsia" w:ascii="宋体" w:hAnsi="宋体" w:eastAsia="宋体" w:cs="宋体"/>
-          <w:lang w:val="en-US" w:eastAsia="zh-CN"/>
-        </w:rPr>
-        <w:t>系统一个或多个功能不满足设计要求，但试验后所有功能能自动恢复到正常运行。</w:t>
-      </w:r>
-    </w:p>
-    <w:p>
-      <w:pPr>
-        <w:spacing w:line="360" w:lineRule="auto"/>
-        <w:rPr>
-          <w:rFonts w:hint="eastAsia" w:ascii="宋体" w:hAnsi="宋体" w:eastAsia="宋体" w:cs="宋体"/>
-          <w:lang w:val="en-US" w:eastAsia="zh-CN"/>
-        </w:rPr>
-      </w:pPr>
-    </w:p>
-    <w:p>
-      <w:pPr>
-        <w:spacing w:line="360" w:lineRule="auto"/>
-        <w:rPr>
-          <w:rFonts w:hint="eastAsia" w:ascii="宋体" w:hAnsi="宋体" w:eastAsia="宋体" w:cs="宋体"/>
-          <w:lang w:val="en-US" w:eastAsia="zh-CN"/>
-        </w:rPr>
-      </w:pPr>
-      <w:r>
-        <w:rPr>
-          <w:rFonts w:hint="eastAsia" w:ascii="宋体" w:hAnsi="宋体" w:eastAsia="宋体" w:cs="宋体"/>
-          <w:b w:val="0"/>
-          <w:bCs/>
-          <w:color w:val="auto"/>
-          <w:sz w:val="21"/>
-          <w:szCs w:val="21"/>
-          <w:lang w:val="en-US" w:eastAsia="zh-CN"/>
-        </w:rPr>
-        <w:t>D级：</w:t>
-      </w:r>
-      <w:r>
-        <w:rPr>
-          <w:rFonts w:hint="eastAsia" w:ascii="宋体" w:hAnsi="宋体" w:eastAsia="宋体" w:cs="宋体"/>
-          <w:lang w:val="en-US" w:eastAsia="zh-CN"/>
-        </w:rPr>
-        <w:t>试验中装置</w:t>
-      </w:r>
-      <w:r>
-        <w:rPr>
-          <w:rFonts w:hint="eastAsia" w:ascii="宋体" w:hAnsi="宋体" w:eastAsia="宋体" w:cs="宋体"/>
-          <w:b w:val="0"/>
-          <w:bCs/>
-          <w:color w:val="auto"/>
-          <w:sz w:val="21"/>
-          <w:szCs w:val="21"/>
-          <w:lang w:val="en-US" w:eastAsia="zh-CN"/>
-        </w:rPr>
-        <w:t>/</w:t>
-      </w:r>
-      <w:r>
-        <w:rPr>
-          <w:rFonts w:hint="eastAsia" w:ascii="宋体" w:hAnsi="宋体" w:eastAsia="宋体" w:cs="宋体"/>
-          <w:lang w:val="en-US" w:eastAsia="zh-CN"/>
-        </w:rPr>
-        <w:t>系统一个或多个功能不满足设计要求且试验后不能自动恢复到正常运行，需要对装置/系统通过简单操作重新激活。</w:t>
-      </w:r>
-    </w:p>
-    <w:p>
-      <w:pPr>
-        <w:spacing w:line="360" w:lineRule="auto"/>
-        <w:rPr>
-          <w:rFonts w:hint="eastAsia" w:ascii="宋体" w:hAnsi="宋体" w:eastAsia="宋体" w:cs="宋体"/>
-          <w:lang w:val="en-US" w:eastAsia="zh-CN"/>
-        </w:rPr>
-      </w:pPr>
-    </w:p>
-    <w:p>
-      <w:pPr>
-        <w:spacing w:line="360" w:lineRule="auto"/>
-        <w:rPr>
-          <w:rFonts w:hint="eastAsia" w:ascii="宋体" w:hAnsi="宋体" w:eastAsia="宋体" w:cs="宋体"/>
-          <w:b w:val="0"/>
-          <w:bCs/>
-          <w:color w:val="auto"/>
-          <w:sz w:val="21"/>
-          <w:szCs w:val="21"/>
-          <w:lang w:val="en-US" w:eastAsia="zh-CN"/>
-        </w:rPr>
-      </w:pPr>
-      <w:r>
-        <w:rPr>
-          <w:rFonts w:hint="eastAsia" w:ascii="宋体" w:hAnsi="宋体" w:eastAsia="宋体" w:cs="宋体"/>
-          <w:b w:val="0"/>
-          <w:bCs/>
-          <w:color w:val="auto"/>
-          <w:sz w:val="21"/>
-          <w:szCs w:val="21"/>
-          <w:lang w:val="en-US" w:eastAsia="zh-CN"/>
-        </w:rPr>
-        <w:t>E级：试验中装置/系统一个或多个功能不满足设计要求且试验后不能自动恢复到规定运行，需要对装置/系统进行修理或更换。</w:t>
+          <w:b w:val="0"/>
+          <w:bCs/>
+          <w:color w:val="auto"/>
+          <w:sz w:val="21"/>
+          <w:szCs w:val="21"/>
+          <w:lang w:val="en-US" w:eastAsia="zh-CN"/>
+        </w:rPr>
+      </w:pPr>
+      <w:r>
+        <w:rPr>
+          <w:rFonts w:hint="eastAsia" w:ascii="宋体" w:hAnsi="宋体" w:eastAsia="宋体" w:cs="宋体"/>
+          <w:b w:val="0"/>
+          <w:bCs/>
+          <w:color w:val="auto"/>
+          <w:sz w:val="21"/>
+          <w:szCs w:val="21"/>
+          <w:lang w:val="en-US" w:eastAsia="zh-CN"/>
+        </w:rPr>
+        <w:t>B级</w:t>
+      </w:r>
+    </w:p>
+    <w:p>
+      <w:pPr>
+        <w:spacing w:line="360" w:lineRule="auto"/>
+        <w:rPr>
+          <w:rFonts w:hint="eastAsia" w:ascii="宋体" w:hAnsi="宋体" w:eastAsia="宋体" w:cs="宋体"/>
+          <w:b w:val="0"/>
+          <w:bCs/>
+          <w:color w:val="auto"/>
+          <w:sz w:val="21"/>
+          <w:szCs w:val="21"/>
+          <w:lang w:val="en-US" w:eastAsia="zh-CN"/>
+        </w:rPr>
+      </w:pPr>
+      <w:r>
+        <w:rPr>
+          <w:rFonts w:hint="eastAsia" w:ascii="宋体" w:hAnsi="宋体" w:eastAsia="宋体" w:cs="宋体"/>
+          <w:b w:val="0"/>
+          <w:bCs/>
+          <w:color w:val="auto"/>
+          <w:sz w:val="21"/>
+          <w:szCs w:val="21"/>
+          <w:lang w:val="en-US" w:eastAsia="zh-CN"/>
+        </w:rPr>
+        <w:t>试验中装置/系统所有功能满足设计要求，但允许有一个或多个超出规定允差。试验后所有功能应自动恢复到规定限值。存储器功能应符合A级。</w:t>
+      </w:r>
+    </w:p>
+    <w:p>
+      <w:pPr>
+        <w:spacing w:line="360" w:lineRule="auto"/>
+        <w:rPr>
+          <w:rFonts w:hint="eastAsia" w:ascii="宋体" w:hAnsi="宋体" w:eastAsia="宋体" w:cs="宋体"/>
+          <w:b w:val="0"/>
+          <w:bCs/>
+          <w:color w:val="auto"/>
+          <w:sz w:val="21"/>
+          <w:szCs w:val="21"/>
+          <w:lang w:val="en-US" w:eastAsia="zh-CN"/>
+        </w:rPr>
+      </w:pPr>
+      <w:r>
+        <w:rPr>
+          <w:rFonts w:hint="eastAsia" w:ascii="宋体" w:hAnsi="宋体" w:eastAsia="宋体" w:cs="宋体"/>
+          <w:b w:val="0"/>
+          <w:bCs/>
+          <w:color w:val="auto"/>
+          <w:sz w:val="21"/>
+          <w:szCs w:val="21"/>
+          <w:lang w:val="en-US" w:eastAsia="zh-CN"/>
+        </w:rPr>
+        <w:t>C级</w:t>
+      </w:r>
+    </w:p>
+    <w:p>
+      <w:pPr>
+        <w:spacing w:line="360" w:lineRule="auto"/>
+        <w:rPr>
+          <w:rFonts w:hint="eastAsia" w:ascii="宋体" w:hAnsi="宋体" w:eastAsia="宋体" w:cs="宋体"/>
+          <w:b w:val="0"/>
+          <w:bCs/>
+          <w:color w:val="auto"/>
+          <w:sz w:val="21"/>
+          <w:szCs w:val="21"/>
+          <w:lang w:val="en-US" w:eastAsia="zh-CN"/>
+        </w:rPr>
+      </w:pPr>
+      <w:r>
+        <w:rPr>
+          <w:rFonts w:hint="eastAsia" w:ascii="宋体" w:hAnsi="宋体" w:eastAsia="宋体" w:cs="宋体"/>
+          <w:b w:val="0"/>
+          <w:bCs/>
+          <w:color w:val="auto"/>
+          <w:sz w:val="21"/>
+          <w:szCs w:val="21"/>
+          <w:lang w:val="en-US" w:eastAsia="zh-CN"/>
+        </w:rPr>
+        <w:t>试验中装置/系统一个或多个功能不满足设计要求，但试验后所有功能能自动恢复到正常运行。</w:t>
+      </w:r>
+    </w:p>
+    <w:p>
+      <w:pPr>
+        <w:spacing w:line="360" w:lineRule="auto"/>
+        <w:rPr>
+          <w:rFonts w:hint="eastAsia" w:ascii="宋体" w:hAnsi="宋体" w:eastAsia="宋体" w:cs="宋体"/>
+          <w:b w:val="0"/>
+          <w:bCs/>
+          <w:color w:val="auto"/>
+          <w:sz w:val="21"/>
+          <w:szCs w:val="21"/>
+          <w:lang w:val="en-US" w:eastAsia="zh-CN"/>
+        </w:rPr>
+      </w:pPr>
+      <w:r>
+        <w:rPr>
+          <w:rFonts w:hint="eastAsia" w:ascii="宋体" w:hAnsi="宋体" w:eastAsia="宋体" w:cs="宋体"/>
+          <w:b w:val="0"/>
+          <w:bCs/>
+          <w:color w:val="auto"/>
+          <w:sz w:val="21"/>
+          <w:szCs w:val="21"/>
+          <w:lang w:val="en-US" w:eastAsia="zh-CN"/>
+        </w:rPr>
+        <w:t>D级</w:t>
+      </w:r>
+    </w:p>
+    <w:p>
+      <w:pPr>
+        <w:spacing w:line="360" w:lineRule="auto"/>
+        <w:rPr>
+          <w:rFonts w:hint="eastAsia" w:ascii="宋体" w:hAnsi="宋体" w:eastAsia="宋体" w:cs="宋体"/>
+          <w:b w:val="0"/>
+          <w:bCs/>
+          <w:color w:val="auto"/>
+          <w:sz w:val="21"/>
+          <w:szCs w:val="21"/>
+          <w:lang w:val="en-US" w:eastAsia="zh-CN"/>
+        </w:rPr>
+      </w:pPr>
+      <w:r>
+        <w:rPr>
+          <w:rFonts w:hint="eastAsia" w:ascii="宋体" w:hAnsi="宋体" w:eastAsia="宋体" w:cs="宋体"/>
+          <w:b w:val="0"/>
+          <w:bCs/>
+          <w:color w:val="auto"/>
+          <w:sz w:val="21"/>
+          <w:szCs w:val="21"/>
+          <w:lang w:val="en-US" w:eastAsia="zh-CN"/>
+        </w:rPr>
+        <w:t>试验中装置/系统一个或多个功能不满足设计要求且试验后不能自动恢复到正常运行，需要对装置/系统通过简单操作重新激活。</w:t>
+      </w:r>
+    </w:p>
+    <w:p>
+      <w:pPr>
+        <w:spacing w:line="360" w:lineRule="auto"/>
+        <w:rPr>
+          <w:rFonts w:hint="eastAsia" w:ascii="宋体" w:hAnsi="宋体" w:eastAsia="宋体" w:cs="宋体"/>
+          <w:b w:val="0"/>
+          <w:bCs/>
+          <w:color w:val="auto"/>
+          <w:sz w:val="21"/>
+          <w:szCs w:val="21"/>
+          <w:lang w:val="en-US" w:eastAsia="zh-CN"/>
+        </w:rPr>
+      </w:pPr>
+      <w:r>
+        <w:rPr>
+          <w:rFonts w:hint="eastAsia" w:ascii="宋体" w:hAnsi="宋体" w:eastAsia="宋体" w:cs="宋体"/>
+          <w:b w:val="0"/>
+          <w:bCs/>
+          <w:color w:val="auto"/>
+          <w:sz w:val="21"/>
+          <w:szCs w:val="21"/>
+          <w:lang w:val="en-US" w:eastAsia="zh-CN"/>
+        </w:rPr>
+        <w:t>E级</w:t>
+      </w:r>
+    </w:p>
+    <w:p>
+      <w:pPr>
+        <w:spacing w:line="360" w:lineRule="auto"/>
+        <w:rPr>
+          <w:rFonts w:hint="eastAsia" w:ascii="宋体" w:hAnsi="宋体" w:eastAsia="宋体" w:cs="宋体"/>
+          <w:b w:val="0"/>
+          <w:bCs/>
+          <w:color w:val="auto"/>
+          <w:sz w:val="21"/>
+          <w:szCs w:val="21"/>
+          <w:lang w:val="en-US" w:eastAsia="zh-CN"/>
+        </w:rPr>
+      </w:pPr>
+      <w:r>
+        <w:rPr>
+          <w:rFonts w:hint="eastAsia" w:ascii="宋体" w:hAnsi="宋体" w:eastAsia="宋体" w:cs="宋体"/>
+          <w:b w:val="0"/>
+          <w:bCs/>
+          <w:color w:val="auto"/>
+          <w:sz w:val="21"/>
+          <w:szCs w:val="21"/>
+          <w:lang w:val="en-US" w:eastAsia="zh-CN"/>
+        </w:rPr>
+        <w:t>试验中装置/系统一个或多个功能不满足设计要求且试验后不能自动恢复到规定运行，需要对装置/系统进行修理或更换。</w:t>
       </w:r>
     </w:p>
     <w:p>
@@ -755,8 +716,6 @@
           <w:lang w:val="en-US" w:eastAsia="zh-CN"/>
         </w:rPr>
       </w:pPr>
-      <w:bookmarkStart w:id="0" w:name="_GoBack"/>
-      <w:bookmarkEnd w:id="0"/>
     </w:p>
     <w:sectPr>
       <w:headerReference r:id="rId5" w:type="first"/>

</xml_diff>